<commit_message>
Updated features and codes
</commit_message>
<xml_diff>
--- a/dissertation/Detecting SQL Injection Attacks Using Machine Learning or Transformer Models.docx
+++ b/dissertation/Detecting SQL Injection Attacks Using Machine Learning or Transformer Models.docx
@@ -1143,7 +1143,7 @@
           <w:noProof/>
         </w:rPr>
         <w:drawing>
-          <wp:inline distT="0" distB="0" distL="0" distR="0" wp14:anchorId="47624484" wp14:editId="097EC7D4">
+          <wp:inline distT="0" distB="0" distL="0" distR="0" wp14:anchorId="47624484" wp14:editId="7C57C6C1">
             <wp:extent cx="4851918" cy="3423650"/>
             <wp:effectExtent l="0" t="0" r="0" b="5715"/>
             <wp:docPr id="1961922301" name="Picture 3" descr="Web Application Architecture: Definition, Models and Best Practices"/>
@@ -4604,4 +4604,26 @@
     </a:ext>
   </a:extLst>
 </a:theme>
+</file>
+
+<file path=word/webextensions/taskpanes.xml><?xml version="1.0" encoding="utf-8"?>
+<wetp:taskpanes xmlns:wetp="http://schemas.microsoft.com/office/webextensions/taskpanes/2010/11">
+  <wetp:taskpane dockstate="right" visibility="0" width="350" row="0">
+    <wetp:webextensionref xmlns:r="http://schemas.openxmlformats.org/officeDocument/2006/relationships" r:id="rId1"/>
+  </wetp:taskpane>
+</wetp:taskpanes>
+</file>
+
+<file path=word/webextensions/webextension1.xml><?xml version="1.0" encoding="utf-8"?>
+<we:webextension xmlns:we="http://schemas.microsoft.com/office/webextensions/webextension/2010/11" id="{189F3A36-2526-6B40-8D21-5E8B6A4C8345}">
+  <we:reference id="wa200000368" version="1.0.0.0" store="en-US" storeType="OMEX"/>
+  <we:alternateReferences>
+    <we:reference id="wa200000368" version="1.0.0.0" store="en-US" storeType="OMEX"/>
+  </we:alternateReferences>
+  <we:properties>
+    <we:property name="documentId" value="&quot;f683342545f65255&quot;"/>
+  </we:properties>
+  <we:bindings/>
+  <we:snapshot xmlns:r="http://schemas.openxmlformats.org/officeDocument/2006/relationships"/>
+</we:webextension>
 </file>
</xml_diff>